<commit_message>
Add remaining fish products to RA quotation
Extends the seafood price list with King Fish, Pomfret Whole, Grouper
Fish Whole, Red Snapper Whole, Sword Fish Whole, and Lobster Tail,
keeping the same three pricing options (whole/cleaned/fillet) and
prices as the original Tuna Fish, Blue Marlin, and Turado Fish rows.
</commit_message>
<xml_diff>
--- a/invoice/Dhiblawe-Trading-Quotation-RA-Seafood.docx
+++ b/invoice/Dhiblawe-Trading-Quotation-RA-Seafood.docx
@@ -794,6 +794,642 @@
           </w:p>
         </w:tc>
       </w:tr>
+      <w:tr>
+        <w:tc>
+          <w:tcPr>
+            <w:tcW w:type="dxa" w:w="3888"/>
+            <w:vAlign w:val="center"/>
+            <w:shd w:fill="FFFFFF"/>
+            <w:tcBorders>
+              <w:bottom w:val="single" w:sz="4" w:color="E3E6EB"/>
+            </w:tcBorders>
+          </w:tcPr>
+          <w:p>
+            <w:pPr>
+              <w:spacing w:before="140" w:after="140"/>
+              <w:jc w:val="left"/>
+            </w:pPr>
+            <w:r>
+              <w:rPr>
+                <w:rFonts w:ascii="Calibri" w:hAnsi="Calibri"/>
+                <w:b w:val="0"/>
+                <w:i w:val="0"/>
+                <w:color w:val="101D3A"/>
+                <w:sz w:val="21"/>
+              </w:rPr>
+              <w:t>King Fish</w:t>
+            </w:r>
+          </w:p>
+        </w:tc>
+        <w:tc>
+          <w:tcPr>
+            <w:tcW w:type="dxa" w:w="1829"/>
+            <w:vAlign w:val="center"/>
+            <w:shd w:fill="FFFFFF"/>
+            <w:tcBorders>
+              <w:bottom w:val="single" w:sz="4" w:color="E3E6EB"/>
+            </w:tcBorders>
+          </w:tcPr>
+          <w:p>
+            <w:pPr>
+              <w:spacing w:before="140" w:after="140"/>
+              <w:jc w:val="center"/>
+            </w:pPr>
+            <w:r>
+              <w:rPr>
+                <w:rFonts w:ascii="Calibri" w:hAnsi="Calibri"/>
+                <w:b/>
+                <w:i w:val="0"/>
+                <w:color w:val="0E8A3C"/>
+                <w:sz w:val="21"/>
+              </w:rPr>
+              <w:t>$ 5.80</w:t>
+            </w:r>
+          </w:p>
+        </w:tc>
+        <w:tc>
+          <w:tcPr>
+            <w:tcW w:type="dxa" w:w="1829"/>
+            <w:vAlign w:val="center"/>
+            <w:shd w:fill="FFFFFF"/>
+            <w:tcBorders>
+              <w:bottom w:val="single" w:sz="4" w:color="E3E6EB"/>
+            </w:tcBorders>
+          </w:tcPr>
+          <w:p>
+            <w:pPr>
+              <w:spacing w:before="140" w:after="140"/>
+              <w:jc w:val="center"/>
+            </w:pPr>
+            <w:r>
+              <w:rPr>
+                <w:rFonts w:ascii="Calibri" w:hAnsi="Calibri"/>
+                <w:b/>
+                <w:i w:val="0"/>
+                <w:color w:val="0E8A3C"/>
+                <w:sz w:val="21"/>
+              </w:rPr>
+              <w:t>$ 6.00</w:t>
+            </w:r>
+          </w:p>
+        </w:tc>
+        <w:tc>
+          <w:tcPr>
+            <w:tcW w:type="dxa" w:w="1814"/>
+            <w:vAlign w:val="center"/>
+            <w:shd w:fill="FFFFFF"/>
+            <w:tcBorders>
+              <w:bottom w:val="single" w:sz="4" w:color="E3E6EB"/>
+            </w:tcBorders>
+          </w:tcPr>
+          <w:p>
+            <w:pPr>
+              <w:spacing w:before="140" w:after="140"/>
+              <w:jc w:val="center"/>
+            </w:pPr>
+            <w:r>
+              <w:rPr>
+                <w:rFonts w:ascii="Calibri" w:hAnsi="Calibri"/>
+                <w:b/>
+                <w:i w:val="0"/>
+                <w:color w:val="0E8A3C"/>
+                <w:sz w:val="21"/>
+              </w:rPr>
+              <w:t>$ 7.00</w:t>
+            </w:r>
+          </w:p>
+        </w:tc>
+      </w:tr>
+      <w:tr>
+        <w:tc>
+          <w:tcPr>
+            <w:tcW w:type="dxa" w:w="3888"/>
+            <w:vAlign w:val="center"/>
+            <w:shd w:fill="F7F8FA"/>
+            <w:tcBorders>
+              <w:bottom w:val="single" w:sz="4" w:color="E3E6EB"/>
+            </w:tcBorders>
+          </w:tcPr>
+          <w:p>
+            <w:pPr>
+              <w:spacing w:before="140" w:after="140"/>
+              <w:jc w:val="left"/>
+            </w:pPr>
+            <w:r>
+              <w:rPr>
+                <w:rFonts w:ascii="Calibri" w:hAnsi="Calibri"/>
+                <w:b w:val="0"/>
+                <w:i w:val="0"/>
+                <w:color w:val="101D3A"/>
+                <w:sz w:val="21"/>
+              </w:rPr>
+              <w:t>Pomfret Whole</w:t>
+            </w:r>
+          </w:p>
+        </w:tc>
+        <w:tc>
+          <w:tcPr>
+            <w:tcW w:type="dxa" w:w="1829"/>
+            <w:vAlign w:val="center"/>
+            <w:shd w:fill="F7F8FA"/>
+            <w:tcBorders>
+              <w:bottom w:val="single" w:sz="4" w:color="E3E6EB"/>
+            </w:tcBorders>
+          </w:tcPr>
+          <w:p>
+            <w:pPr>
+              <w:spacing w:before="140" w:after="140"/>
+              <w:jc w:val="center"/>
+            </w:pPr>
+            <w:r>
+              <w:rPr>
+                <w:rFonts w:ascii="Calibri" w:hAnsi="Calibri"/>
+                <w:b/>
+                <w:i w:val="0"/>
+                <w:color w:val="0E8A3C"/>
+                <w:sz w:val="21"/>
+              </w:rPr>
+              <w:t>$ 5.80</w:t>
+            </w:r>
+          </w:p>
+        </w:tc>
+        <w:tc>
+          <w:tcPr>
+            <w:tcW w:type="dxa" w:w="1829"/>
+            <w:vAlign w:val="center"/>
+            <w:shd w:fill="F7F8FA"/>
+            <w:tcBorders>
+              <w:bottom w:val="single" w:sz="4" w:color="E3E6EB"/>
+            </w:tcBorders>
+          </w:tcPr>
+          <w:p>
+            <w:pPr>
+              <w:spacing w:before="140" w:after="140"/>
+              <w:jc w:val="center"/>
+            </w:pPr>
+            <w:r>
+              <w:rPr>
+                <w:rFonts w:ascii="Calibri" w:hAnsi="Calibri"/>
+                <w:b/>
+                <w:i w:val="0"/>
+                <w:color w:val="0E8A3C"/>
+                <w:sz w:val="21"/>
+              </w:rPr>
+              <w:t>$ 6.00</w:t>
+            </w:r>
+          </w:p>
+        </w:tc>
+        <w:tc>
+          <w:tcPr>
+            <w:tcW w:type="dxa" w:w="1814"/>
+            <w:vAlign w:val="center"/>
+            <w:shd w:fill="F7F8FA"/>
+            <w:tcBorders>
+              <w:bottom w:val="single" w:sz="4" w:color="E3E6EB"/>
+            </w:tcBorders>
+          </w:tcPr>
+          <w:p>
+            <w:pPr>
+              <w:spacing w:before="140" w:after="140"/>
+              <w:jc w:val="center"/>
+            </w:pPr>
+            <w:r>
+              <w:rPr>
+                <w:rFonts w:ascii="Calibri" w:hAnsi="Calibri"/>
+                <w:b/>
+                <w:i w:val="0"/>
+                <w:color w:val="0E8A3C"/>
+                <w:sz w:val="21"/>
+              </w:rPr>
+              <w:t>$ 7.00</w:t>
+            </w:r>
+          </w:p>
+        </w:tc>
+      </w:tr>
+      <w:tr>
+        <w:tc>
+          <w:tcPr>
+            <w:tcW w:type="dxa" w:w="3888"/>
+            <w:vAlign w:val="center"/>
+            <w:shd w:fill="FFFFFF"/>
+            <w:tcBorders>
+              <w:bottom w:val="single" w:sz="4" w:color="E3E6EB"/>
+            </w:tcBorders>
+          </w:tcPr>
+          <w:p>
+            <w:pPr>
+              <w:spacing w:before="140" w:after="140"/>
+              <w:jc w:val="left"/>
+            </w:pPr>
+            <w:r>
+              <w:rPr>
+                <w:rFonts w:ascii="Calibri" w:hAnsi="Calibri"/>
+                <w:b w:val="0"/>
+                <w:i w:val="0"/>
+                <w:color w:val="101D3A"/>
+                <w:sz w:val="21"/>
+              </w:rPr>
+              <w:t>Grouper Fish Whole</w:t>
+            </w:r>
+          </w:p>
+        </w:tc>
+        <w:tc>
+          <w:tcPr>
+            <w:tcW w:type="dxa" w:w="1829"/>
+            <w:vAlign w:val="center"/>
+            <w:shd w:fill="FFFFFF"/>
+            <w:tcBorders>
+              <w:bottom w:val="single" w:sz="4" w:color="E3E6EB"/>
+            </w:tcBorders>
+          </w:tcPr>
+          <w:p>
+            <w:pPr>
+              <w:spacing w:before="140" w:after="140"/>
+              <w:jc w:val="center"/>
+            </w:pPr>
+            <w:r>
+              <w:rPr>
+                <w:rFonts w:ascii="Calibri" w:hAnsi="Calibri"/>
+                <w:b/>
+                <w:i w:val="0"/>
+                <w:color w:val="0E8A3C"/>
+                <w:sz w:val="21"/>
+              </w:rPr>
+              <w:t>$ 5.80</w:t>
+            </w:r>
+          </w:p>
+        </w:tc>
+        <w:tc>
+          <w:tcPr>
+            <w:tcW w:type="dxa" w:w="1829"/>
+            <w:vAlign w:val="center"/>
+            <w:shd w:fill="FFFFFF"/>
+            <w:tcBorders>
+              <w:bottom w:val="single" w:sz="4" w:color="E3E6EB"/>
+            </w:tcBorders>
+          </w:tcPr>
+          <w:p>
+            <w:pPr>
+              <w:spacing w:before="140" w:after="140"/>
+              <w:jc w:val="center"/>
+            </w:pPr>
+            <w:r>
+              <w:rPr>
+                <w:rFonts w:ascii="Calibri" w:hAnsi="Calibri"/>
+                <w:b/>
+                <w:i w:val="0"/>
+                <w:color w:val="0E8A3C"/>
+                <w:sz w:val="21"/>
+              </w:rPr>
+              <w:t>$ 6.00</w:t>
+            </w:r>
+          </w:p>
+        </w:tc>
+        <w:tc>
+          <w:tcPr>
+            <w:tcW w:type="dxa" w:w="1814"/>
+            <w:vAlign w:val="center"/>
+            <w:shd w:fill="FFFFFF"/>
+            <w:tcBorders>
+              <w:bottom w:val="single" w:sz="4" w:color="E3E6EB"/>
+            </w:tcBorders>
+          </w:tcPr>
+          <w:p>
+            <w:pPr>
+              <w:spacing w:before="140" w:after="140"/>
+              <w:jc w:val="center"/>
+            </w:pPr>
+            <w:r>
+              <w:rPr>
+                <w:rFonts w:ascii="Calibri" w:hAnsi="Calibri"/>
+                <w:b/>
+                <w:i w:val="0"/>
+                <w:color w:val="0E8A3C"/>
+                <w:sz w:val="21"/>
+              </w:rPr>
+              <w:t>$ 7.00</w:t>
+            </w:r>
+          </w:p>
+        </w:tc>
+      </w:tr>
+      <w:tr>
+        <w:tc>
+          <w:tcPr>
+            <w:tcW w:type="dxa" w:w="3888"/>
+            <w:vAlign w:val="center"/>
+            <w:shd w:fill="F7F8FA"/>
+            <w:tcBorders>
+              <w:bottom w:val="single" w:sz="4" w:color="E3E6EB"/>
+            </w:tcBorders>
+          </w:tcPr>
+          <w:p>
+            <w:pPr>
+              <w:spacing w:before="140" w:after="140"/>
+              <w:jc w:val="left"/>
+            </w:pPr>
+            <w:r>
+              <w:rPr>
+                <w:rFonts w:ascii="Calibri" w:hAnsi="Calibri"/>
+                <w:b w:val="0"/>
+                <w:i w:val="0"/>
+                <w:color w:val="101D3A"/>
+                <w:sz w:val="21"/>
+              </w:rPr>
+              <w:t>Red Snapper Whole</w:t>
+            </w:r>
+          </w:p>
+        </w:tc>
+        <w:tc>
+          <w:tcPr>
+            <w:tcW w:type="dxa" w:w="1829"/>
+            <w:vAlign w:val="center"/>
+            <w:shd w:fill="F7F8FA"/>
+            <w:tcBorders>
+              <w:bottom w:val="single" w:sz="4" w:color="E3E6EB"/>
+            </w:tcBorders>
+          </w:tcPr>
+          <w:p>
+            <w:pPr>
+              <w:spacing w:before="140" w:after="140"/>
+              <w:jc w:val="center"/>
+            </w:pPr>
+            <w:r>
+              <w:rPr>
+                <w:rFonts w:ascii="Calibri" w:hAnsi="Calibri"/>
+                <w:b/>
+                <w:i w:val="0"/>
+                <w:color w:val="0E8A3C"/>
+                <w:sz w:val="21"/>
+              </w:rPr>
+              <w:t>$ 5.80</w:t>
+            </w:r>
+          </w:p>
+        </w:tc>
+        <w:tc>
+          <w:tcPr>
+            <w:tcW w:type="dxa" w:w="1829"/>
+            <w:vAlign w:val="center"/>
+            <w:shd w:fill="F7F8FA"/>
+            <w:tcBorders>
+              <w:bottom w:val="single" w:sz="4" w:color="E3E6EB"/>
+            </w:tcBorders>
+          </w:tcPr>
+          <w:p>
+            <w:pPr>
+              <w:spacing w:before="140" w:after="140"/>
+              <w:jc w:val="center"/>
+            </w:pPr>
+            <w:r>
+              <w:rPr>
+                <w:rFonts w:ascii="Calibri" w:hAnsi="Calibri"/>
+                <w:b/>
+                <w:i w:val="0"/>
+                <w:color w:val="0E8A3C"/>
+                <w:sz w:val="21"/>
+              </w:rPr>
+              <w:t>$ 6.00</w:t>
+            </w:r>
+          </w:p>
+        </w:tc>
+        <w:tc>
+          <w:tcPr>
+            <w:tcW w:type="dxa" w:w="1814"/>
+            <w:vAlign w:val="center"/>
+            <w:shd w:fill="F7F8FA"/>
+            <w:tcBorders>
+              <w:bottom w:val="single" w:sz="4" w:color="E3E6EB"/>
+            </w:tcBorders>
+          </w:tcPr>
+          <w:p>
+            <w:pPr>
+              <w:spacing w:before="140" w:after="140"/>
+              <w:jc w:val="center"/>
+            </w:pPr>
+            <w:r>
+              <w:rPr>
+                <w:rFonts w:ascii="Calibri" w:hAnsi="Calibri"/>
+                <w:b/>
+                <w:i w:val="0"/>
+                <w:color w:val="0E8A3C"/>
+                <w:sz w:val="21"/>
+              </w:rPr>
+              <w:t>$ 7.00</w:t>
+            </w:r>
+          </w:p>
+        </w:tc>
+      </w:tr>
+      <w:tr>
+        <w:tc>
+          <w:tcPr>
+            <w:tcW w:type="dxa" w:w="3888"/>
+            <w:vAlign w:val="center"/>
+            <w:shd w:fill="FFFFFF"/>
+            <w:tcBorders>
+              <w:bottom w:val="single" w:sz="4" w:color="E3E6EB"/>
+            </w:tcBorders>
+          </w:tcPr>
+          <w:p>
+            <w:pPr>
+              <w:spacing w:before="140" w:after="140"/>
+              <w:jc w:val="left"/>
+            </w:pPr>
+            <w:r>
+              <w:rPr>
+                <w:rFonts w:ascii="Calibri" w:hAnsi="Calibri"/>
+                <w:b w:val="0"/>
+                <w:i w:val="0"/>
+                <w:color w:val="101D3A"/>
+                <w:sz w:val="21"/>
+              </w:rPr>
+              <w:t>Sword Fish Whole</w:t>
+            </w:r>
+          </w:p>
+        </w:tc>
+        <w:tc>
+          <w:tcPr>
+            <w:tcW w:type="dxa" w:w="1829"/>
+            <w:vAlign w:val="center"/>
+            <w:shd w:fill="FFFFFF"/>
+            <w:tcBorders>
+              <w:bottom w:val="single" w:sz="4" w:color="E3E6EB"/>
+            </w:tcBorders>
+          </w:tcPr>
+          <w:p>
+            <w:pPr>
+              <w:spacing w:before="140" w:after="140"/>
+              <w:jc w:val="center"/>
+            </w:pPr>
+            <w:r>
+              <w:rPr>
+                <w:rFonts w:ascii="Calibri" w:hAnsi="Calibri"/>
+                <w:b/>
+                <w:i w:val="0"/>
+                <w:color w:val="0E8A3C"/>
+                <w:sz w:val="21"/>
+              </w:rPr>
+              <w:t>$ 5.80</w:t>
+            </w:r>
+          </w:p>
+        </w:tc>
+        <w:tc>
+          <w:tcPr>
+            <w:tcW w:type="dxa" w:w="1829"/>
+            <w:vAlign w:val="center"/>
+            <w:shd w:fill="FFFFFF"/>
+            <w:tcBorders>
+              <w:bottom w:val="single" w:sz="4" w:color="E3E6EB"/>
+            </w:tcBorders>
+          </w:tcPr>
+          <w:p>
+            <w:pPr>
+              <w:spacing w:before="140" w:after="140"/>
+              <w:jc w:val="center"/>
+            </w:pPr>
+            <w:r>
+              <w:rPr>
+                <w:rFonts w:ascii="Calibri" w:hAnsi="Calibri"/>
+                <w:b/>
+                <w:i w:val="0"/>
+                <w:color w:val="0E8A3C"/>
+                <w:sz w:val="21"/>
+              </w:rPr>
+              <w:t>$ 6.00</w:t>
+            </w:r>
+          </w:p>
+        </w:tc>
+        <w:tc>
+          <w:tcPr>
+            <w:tcW w:type="dxa" w:w="1814"/>
+            <w:vAlign w:val="center"/>
+            <w:shd w:fill="FFFFFF"/>
+            <w:tcBorders>
+              <w:bottom w:val="single" w:sz="4" w:color="E3E6EB"/>
+            </w:tcBorders>
+          </w:tcPr>
+          <w:p>
+            <w:pPr>
+              <w:spacing w:before="140" w:after="140"/>
+              <w:jc w:val="center"/>
+            </w:pPr>
+            <w:r>
+              <w:rPr>
+                <w:rFonts w:ascii="Calibri" w:hAnsi="Calibri"/>
+                <w:b/>
+                <w:i w:val="0"/>
+                <w:color w:val="0E8A3C"/>
+                <w:sz w:val="21"/>
+              </w:rPr>
+              <w:t>$ 7.00</w:t>
+            </w:r>
+          </w:p>
+        </w:tc>
+      </w:tr>
+      <w:tr>
+        <w:tc>
+          <w:tcPr>
+            <w:tcW w:type="dxa" w:w="3888"/>
+            <w:vAlign w:val="center"/>
+            <w:shd w:fill="F7F8FA"/>
+            <w:tcBorders>
+              <w:bottom w:val="single" w:sz="4" w:color="E3E6EB"/>
+            </w:tcBorders>
+          </w:tcPr>
+          <w:p>
+            <w:pPr>
+              <w:spacing w:before="140" w:after="140"/>
+              <w:jc w:val="left"/>
+            </w:pPr>
+            <w:r>
+              <w:rPr>
+                <w:rFonts w:ascii="Calibri" w:hAnsi="Calibri"/>
+                <w:b w:val="0"/>
+                <w:i w:val="0"/>
+                <w:color w:val="101D3A"/>
+                <w:sz w:val="21"/>
+              </w:rPr>
+              <w:t>Lobster Tail</w:t>
+            </w:r>
+          </w:p>
+        </w:tc>
+        <w:tc>
+          <w:tcPr>
+            <w:tcW w:type="dxa" w:w="1829"/>
+            <w:vAlign w:val="center"/>
+            <w:shd w:fill="F7F8FA"/>
+            <w:tcBorders>
+              <w:bottom w:val="single" w:sz="4" w:color="E3E6EB"/>
+            </w:tcBorders>
+          </w:tcPr>
+          <w:p>
+            <w:pPr>
+              <w:spacing w:before="140" w:after="140"/>
+              <w:jc w:val="center"/>
+            </w:pPr>
+            <w:r>
+              <w:rPr>
+                <w:rFonts w:ascii="Calibri" w:hAnsi="Calibri"/>
+                <w:b/>
+                <w:i w:val="0"/>
+                <w:color w:val="0E8A3C"/>
+                <w:sz w:val="21"/>
+              </w:rPr>
+              <w:t>$ 5.80</w:t>
+            </w:r>
+          </w:p>
+        </w:tc>
+        <w:tc>
+          <w:tcPr>
+            <w:tcW w:type="dxa" w:w="1829"/>
+            <w:vAlign w:val="center"/>
+            <w:shd w:fill="F7F8FA"/>
+            <w:tcBorders>
+              <w:bottom w:val="single" w:sz="4" w:color="E3E6EB"/>
+            </w:tcBorders>
+          </w:tcPr>
+          <w:p>
+            <w:pPr>
+              <w:spacing w:before="140" w:after="140"/>
+              <w:jc w:val="center"/>
+            </w:pPr>
+            <w:r>
+              <w:rPr>
+                <w:rFonts w:ascii="Calibri" w:hAnsi="Calibri"/>
+                <w:b/>
+                <w:i w:val="0"/>
+                <w:color w:val="0E8A3C"/>
+                <w:sz w:val="21"/>
+              </w:rPr>
+              <w:t>$ 6.00</w:t>
+            </w:r>
+          </w:p>
+        </w:tc>
+        <w:tc>
+          <w:tcPr>
+            <w:tcW w:type="dxa" w:w="1814"/>
+            <w:vAlign w:val="center"/>
+            <w:shd w:fill="F7F8FA"/>
+            <w:tcBorders>
+              <w:bottom w:val="single" w:sz="4" w:color="E3E6EB"/>
+            </w:tcBorders>
+          </w:tcPr>
+          <w:p>
+            <w:pPr>
+              <w:spacing w:before="140" w:after="140"/>
+              <w:jc w:val="center"/>
+            </w:pPr>
+            <w:r>
+              <w:rPr>
+                <w:rFonts w:ascii="Calibri" w:hAnsi="Calibri"/>
+                <w:b/>
+                <w:i w:val="0"/>
+                <w:color w:val="0E8A3C"/>
+                <w:sz w:val="21"/>
+              </w:rPr>
+              <w:t>$ 7.00</w:t>
+            </w:r>
+          </w:p>
+        </w:tc>
+      </w:tr>
     </w:tbl>
     <w:p>
       <w:pPr>

</xml_diff>